<commit_message>
Remove emissions per capita and add emissions change. Update dataset and all supplementary tables and figures.
</commit_message>
<xml_diff>
--- a/Figures & Tables/ED Table X_Inc Group + Metadata.docx
+++ b/Figures & Tables/ED Table X_Inc Group + Metadata.docx
@@ -13381,7 +13381,7 @@
                 <w:szCs w:val="20"/>
                 <w:color w:val="000000"/>
               </w:rPr>
-              <w:t xml:space="preserve">Agri-food systems greenhouse gas emissions per capita</w:t>
+              <w:t xml:space="preserve">Agri-food systems greenhouse gas emissions change</w:t>
             </w:r>
           </w:p>
         </w:tc>
@@ -13435,7 +13435,7 @@
                 <w:szCs w:val="20"/>
                 <w:color w:val="000000"/>
               </w:rPr>
-              <w:t xml:space="preserve">tonnes CO2eq / capita</w:t>
+              <w:t xml:space="preserve">Percent change relative to 2000-2010 country average baseline</w:t>
             </w:r>
           </w:p>
         </w:tc>
@@ -13597,7 +13597,7 @@
                 <w:szCs w:val="20"/>
                 <w:color w:val="000000"/>
               </w:rPr>
-              <w:t xml:space="preserve">2.2</w:t>
+              <w:t xml:space="preserve">129.1</w:t>
             </w:r>
           </w:p>
         </w:tc>
@@ -13651,7 +13651,7 @@
                 <w:szCs w:val="20"/>
                 <w:color w:val="000000"/>
               </w:rPr>
-              <w:t xml:space="preserve">2.1</w:t>
+              <w:t xml:space="preserve">129.9</w:t>
             </w:r>
           </w:p>
         </w:tc>
@@ -13705,7 +13705,7 @@
                 <w:szCs w:val="20"/>
                 <w:color w:val="000000"/>
               </w:rPr>
-              <w:t xml:space="preserve">3.4</w:t>
+              <w:t xml:space="preserve">117.0</w:t>
             </w:r>
           </w:p>
         </w:tc>
@@ -13759,7 +13759,7 @@
                 <w:szCs w:val="20"/>
                 <w:color w:val="000000"/>
               </w:rPr>
-              <w:t xml:space="preserve">3.4</w:t>
+              <w:t xml:space="preserve">110.5</w:t>
             </w:r>
           </w:p>
         </w:tc>
@@ -13813,7 +13813,7 @@
                 <w:szCs w:val="20"/>
                 <w:color w:val="000000"/>
               </w:rPr>
-              <w:t xml:space="preserve">2.8</w:t>
+              <w:t xml:space="preserve">119.8</w:t>
             </w:r>
           </w:p>
         </w:tc>

</xml_diff>